<commit_message>
feat(templates): PS property-seizure date context, paper-file template codes, templates guide
- DocumentContextBuilder: add 'estate_seizure_date' (yyyy-MM-dd, or a
  handwriting fill line when Asset.SeizureDate is absent) for code PS.
- WordTemplatesOptions: mirror appsettings codes 006/007/PS as defensive
  defaults (kept in sync letter-for-letter with appsettings.json).
- property seizure.docx: updated template binary.
- DocumentContextBuilderTests: assert formatted seizure date and the
  missing-date fill-line branch.
- docs/WORD_TEMPLATES_GUIDE.md: operational reference for template edits,
  placeholder syntax, adding new templates, and the verification checklist.
</commit_message>
<xml_diff>
--- a/backend/src/DocGenerator.Api/WordTemplates/property seizure.docx
+++ b/backend/src/DocGenerator.Api/WordTemplates/property seizure.docx
@@ -5,6 +5,7 @@
     <w:p>
       <w:pPr>
         <w:rPr>
+          <w:rFonts w:hint="cs"/>
           <w:rtl/>
           <w:lang w:bidi="ar-SY"/>
         </w:rPr>
@@ -669,7 +670,21 @@
           <w:rtl/>
           <w:lang w:bidi="ar-SY"/>
         </w:rPr>
-        <w:t xml:space="preserve">بتاريخ (.........................................) وضع إشارة الحجز التنفيذي على حصة المنفذ عليه </w:t>
+        <w:t xml:space="preserve">بتاريخ </w:t>
+      </w:r>
+      <w:r>
+        <w:rPr>
+          <w:lang w:bidi="ar-SY"/>
+        </w:rPr>
+        <w:t>{{estate_seizure_date}}</w:t>
+      </w:r>
+      <w:r>
+        <w:rPr>
+          <w:rFonts w:hint="cs"/>
+          <w:rtl/>
+          <w:lang w:bidi="ar-SY"/>
+        </w:rPr>
+        <w:t xml:space="preserve"> وضع إشارة الحجز التنفيذي على حصة المنفذ عليه </w:t>
       </w:r>
       <w:r>
         <w:rPr>
@@ -1721,7 +1736,6 @@
   <w:style w:type="character" w:default="1" w:styleId="a0">
     <w:name w:val="Default Paragraph Font"/>
     <w:uiPriority w:val="1"/>
-    <w:semiHidden/>
     <w:unhideWhenUsed/>
   </w:style>
   <w:style w:type="table" w:default="1" w:styleId="a1">

</xml_diff>